<commit_message>
berhasil menambahkan program download silabus selanjutnya membuat kontroller backup ke google drive seperti rpp
</commit_message>
<xml_diff>
--- a/sdn_lebaksiuh/public/doc/template_silabus.docx
+++ b/sdn_lebaksiuh/public/doc/template_silabus.docx
@@ -728,21 +728,7 @@
           <w:rFonts w:ascii="Arial Narrow" w:hAnsi="Arial Narrow"/>
           <w:szCs w:val="24"/>
         </w:rPr>
-        <w:t>KOMP</w:t>
-      </w:r>
-      <w:r>
-        <w:rPr>
-          <w:rFonts w:ascii="Arial Narrow" w:hAnsi="Arial Narrow"/>
-          <w:szCs w:val="24"/>
-        </w:rPr>
-        <w:t>O</w:t>
-      </w:r>
-      <w:r>
-        <w:rPr>
-          <w:rFonts w:ascii="Arial Narrow" w:hAnsi="Arial Narrow"/>
-          <w:szCs w:val="24"/>
-        </w:rPr>
-        <w:t>TENSI INTI</w:t>
+        <w:t>KOMPOTENSI INTI</w:t>
       </w:r>
     </w:p>
     <w:p>
@@ -765,17 +751,25 @@
           <w:lang w:val="sv-SE"/>
         </w:rPr>
         <w:tab/>
-        <w:t>${komp</w:t>
-      </w:r>
-      <w:r>
+        <w:t>${kompotensi_inti_block}</w:t>
+      </w:r>
+    </w:p>
+    <w:p>
+      <w:pPr>
+        <w:pStyle w:val="Normal"/>
+        <w:numPr>
+          <w:ilvl w:val="0"/>
+          <w:numId w:val="6"/>
+        </w:numPr>
+        <w:spacing w:lineRule="auto" w:line="240" w:before="0" w:after="0"/>
+        <w:jc w:val="both"/>
         <w:rPr>
           <w:rFonts w:ascii="Arial Narrow" w:hAnsi="Arial Narrow"/>
           <w:sz w:val="24"/>
           <w:szCs w:val="24"/>
           <w:lang w:val="sv-SE"/>
         </w:rPr>
-        <w:t>o</w:t>
-      </w:r>
+      </w:pPr>
       <w:r>
         <w:rPr>
           <w:rFonts w:ascii="Arial Narrow" w:hAnsi="Arial Narrow"/>
@@ -783,7 +777,16 @@
           <w:szCs w:val="24"/>
           <w:lang w:val="sv-SE"/>
         </w:rPr>
-        <w:t>tensi_inti_block}</w:t>
+        <w:t xml:space="preserve"> </w:t>
+      </w:r>
+      <w:r>
+        <w:rPr>
+          <w:rFonts w:ascii="Arial Narrow" w:hAnsi="Arial Narrow"/>
+          <w:sz w:val="24"/>
+          <w:szCs w:val="24"/>
+          <w:lang w:val="sv-SE"/>
+        </w:rPr>
+        <w:t>${konten_kompetensi_inti}</w:t>
       </w:r>
     </w:p>
     <w:p>
@@ -806,48 +809,7 @@
           <w:lang w:val="sv-SE"/>
         </w:rPr>
         <w:tab/>
-        <w:t>${urutan}. ${konten_kompetensi_inti}</w:t>
-      </w:r>
-    </w:p>
-    <w:p>
-      <w:pPr>
-        <w:pStyle w:val="Normal"/>
-        <w:spacing w:lineRule="auto" w:line="240" w:before="0" w:after="0"/>
-        <w:jc w:val="both"/>
-        <w:rPr>
-          <w:rFonts w:ascii="Arial Narrow" w:hAnsi="Arial Narrow"/>
-          <w:sz w:val="24"/>
-          <w:szCs w:val="24"/>
-          <w:lang w:val="sv-SE"/>
-        </w:rPr>
-      </w:pPr>
-      <w:r>
-        <w:rPr>
-          <w:rFonts w:ascii="Arial Narrow" w:hAnsi="Arial Narrow"/>
-          <w:sz w:val="24"/>
-          <w:szCs w:val="24"/>
-          <w:lang w:val="sv-SE"/>
-        </w:rPr>
-        <w:tab/>
-        <w:t>${/komp</w:t>
-      </w:r>
-      <w:r>
-        <w:rPr>
-          <w:rFonts w:ascii="Arial Narrow" w:hAnsi="Arial Narrow"/>
-          <w:sz w:val="24"/>
-          <w:szCs w:val="24"/>
-          <w:lang w:val="sv-SE"/>
-        </w:rPr>
-        <w:t>o</w:t>
-      </w:r>
-      <w:r>
-        <w:rPr>
-          <w:rFonts w:ascii="Arial Narrow" w:hAnsi="Arial Narrow"/>
-          <w:sz w:val="24"/>
-          <w:szCs w:val="24"/>
-          <w:lang w:val="sv-SE"/>
-        </w:rPr>
-        <w:t>tensi_inti_block}</w:t>
+        <w:t>${/kompotensi_inti_block}</w:t>
       </w:r>
     </w:p>
     <w:p>
@@ -910,12 +872,12 @@
         <w:gridCol w:w="1696"/>
         <w:gridCol w:w="2694"/>
         <w:gridCol w:w="2806"/>
-        <w:gridCol w:w="1700"/>
+        <w:gridCol w:w="1701"/>
         <w:gridCol w:w="1832"/>
-        <w:gridCol w:w="1443"/>
-        <w:gridCol w:w="1260"/>
-        <w:gridCol w:w="900"/>
-        <w:gridCol w:w="1795"/>
+        <w:gridCol w:w="1442"/>
+        <w:gridCol w:w="1263"/>
+        <w:gridCol w:w="902"/>
+        <w:gridCol w:w="1790"/>
       </w:tblGrid>
       <w:tr>
         <w:trPr>
@@ -1029,7 +991,7 @@
         </w:tc>
         <w:tc>
           <w:tcPr>
-            <w:tcW w:w="1700" w:type="dxa"/>
+            <w:tcW w:w="1701" w:type="dxa"/>
             <w:tcBorders>
               <w:top w:val="single" w:sz="4" w:space="0" w:color="000000"/>
               <w:left w:val="single" w:sz="4" w:space="0" w:color="000000"/>
@@ -1099,7 +1061,7 @@
         </w:tc>
         <w:tc>
           <w:tcPr>
-            <w:tcW w:w="1443" w:type="dxa"/>
+            <w:tcW w:w="1442" w:type="dxa"/>
             <w:tcBorders>
               <w:top w:val="single" w:sz="4" w:space="0" w:color="000000"/>
               <w:left w:val="single" w:sz="4" w:space="0" w:color="000000"/>
@@ -1127,7 +1089,7 @@
         </w:tc>
         <w:tc>
           <w:tcPr>
-            <w:tcW w:w="1260" w:type="dxa"/>
+            <w:tcW w:w="1263" w:type="dxa"/>
             <w:tcBorders>
               <w:top w:val="single" w:sz="4" w:space="0" w:color="000000"/>
               <w:left w:val="single" w:sz="4" w:space="0" w:color="000000"/>
@@ -1162,7 +1124,7 @@
         </w:tc>
         <w:tc>
           <w:tcPr>
-            <w:tcW w:w="900" w:type="dxa"/>
+            <w:tcW w:w="902" w:type="dxa"/>
             <w:tcBorders>
               <w:top w:val="single" w:sz="4" w:space="0" w:color="000000"/>
               <w:left w:val="single" w:sz="4" w:space="0" w:color="000000"/>
@@ -1197,7 +1159,7 @@
         </w:tc>
         <w:tc>
           <w:tcPr>
-            <w:tcW w:w="1795" w:type="dxa"/>
+            <w:tcW w:w="1790" w:type="dxa"/>
             <w:tcBorders>
               <w:top w:val="single" w:sz="4" w:space="0" w:color="000000"/>
               <w:left w:val="single" w:sz="4" w:space="0" w:color="000000"/>
@@ -1261,34 +1223,7 @@
                 <w:szCs w:val="24"/>
                 <w:lang w:val="id-ID"/>
               </w:rPr>
-              <w:t>$</w:t>
-            </w:r>
-            <w:r>
-              <w:rPr>
-                <w:rFonts w:cs="Arial" w:ascii="Arial Narrow" w:hAnsi="Arial Narrow"/>
-                <w:sz w:val="24"/>
-                <w:szCs w:val="24"/>
-                <w:lang w:val="id-ID"/>
-              </w:rPr>
-              <w:t>{mata_pelajara</w:t>
-            </w:r>
-            <w:r>
-              <w:rPr>
-                <w:rFonts w:cs="Arial" w:ascii="Arial Narrow" w:hAnsi="Arial Narrow"/>
-                <w:sz w:val="24"/>
-                <w:szCs w:val="24"/>
-                <w:lang w:val="id-ID"/>
-              </w:rPr>
-              <w:t>n</w:t>
-            </w:r>
-            <w:r>
-              <w:rPr>
-                <w:rFonts w:cs="Arial" w:ascii="Arial Narrow" w:hAnsi="Arial Narrow"/>
-                <w:sz w:val="24"/>
-                <w:szCs w:val="24"/>
-                <w:lang w:val="id-ID"/>
-              </w:rPr>
-              <w:t>}</w:t>
+              <w:t>${mata_pelajaran}</w:t>
             </w:r>
           </w:p>
         </w:tc>
@@ -1327,27 +1262,46 @@
                 <w:sz w:val="24"/>
                 <w:szCs w:val="24"/>
               </w:rPr>
-              <w:t>${kompotensi_dasar_block}</w:t>
-            </w:r>
-          </w:p>
-          <w:p>
-            <w:pPr>
-              <w:pStyle w:val="Normal"/>
-              <w:spacing w:lineRule="auto" w:line="240" w:before="0" w:after="0"/>
-              <w:ind w:hanging="459" w:left="459"/>
+              <w:t>${komp</w:t>
+            </w:r>
+            <w:r>
               <w:rPr>
                 <w:rFonts w:ascii="Arial Narrow" w:hAnsi="Arial Narrow"/>
                 <w:sz w:val="24"/>
                 <w:szCs w:val="24"/>
               </w:rPr>
-            </w:pPr>
+              <w:t>e</w:t>
+            </w:r>
             <w:r>
               <w:rPr>
                 <w:rFonts w:ascii="Arial Narrow" w:hAnsi="Arial Narrow"/>
                 <w:sz w:val="24"/>
                 <w:szCs w:val="24"/>
               </w:rPr>
-              <w:t>${urutan}. ${konten_kompetensi_dasar}</w:t>
+              <w:t>tensi_dasar_block}</w:t>
+            </w:r>
+          </w:p>
+          <w:p>
+            <w:pPr>
+              <w:pStyle w:val="Normal"/>
+              <w:numPr>
+                <w:ilvl w:val="0"/>
+                <w:numId w:val="5"/>
+              </w:numPr>
+              <w:spacing w:lineRule="auto" w:line="240" w:before="0" w:after="0"/>
+              <w:rPr>
+                <w:rFonts w:ascii="Arial Narrow" w:hAnsi="Arial Narrow"/>
+                <w:sz w:val="24"/>
+                <w:szCs w:val="24"/>
+              </w:rPr>
+            </w:pPr>
+            <w:r>
+              <w:rPr>
+                <w:rFonts w:ascii="Arial Narrow" w:hAnsi="Arial Narrow"/>
+                <w:sz w:val="24"/>
+                <w:szCs w:val="24"/>
+              </w:rPr>
+              <w:t>${konten_kompetensi_dasar}</w:t>
             </w:r>
           </w:p>
           <w:p>
@@ -1404,8 +1358,11 @@
           <w:p>
             <w:pPr>
               <w:pStyle w:val="Normal"/>
-              <w:spacing w:lineRule="auto" w:line="240" w:before="0" w:after="0"/>
-              <w:ind w:hanging="459" w:left="459"/>
+              <w:numPr>
+                <w:ilvl w:val="0"/>
+                <w:numId w:val="7"/>
+              </w:numPr>
+              <w:spacing w:lineRule="auto" w:line="240" w:before="0" w:after="0"/>
               <w:rPr>
                 <w:rFonts w:ascii="Arial Narrow" w:hAnsi="Arial Narrow"/>
                 <w:sz w:val="24"/>
@@ -1418,7 +1375,7 @@
                 <w:sz w:val="24"/>
                 <w:szCs w:val="24"/>
               </w:rPr>
-              <w:t>${urutan}. ${konten_indikator}</w:t>
+              <w:t>${konten_indikator}</w:t>
             </w:r>
           </w:p>
           <w:p>
@@ -1444,7 +1401,7 @@
         </w:tc>
         <w:tc>
           <w:tcPr>
-            <w:tcW w:w="1700" w:type="dxa"/>
+            <w:tcW w:w="1701" w:type="dxa"/>
             <w:tcBorders>
               <w:top w:val="single" w:sz="4" w:space="0" w:color="000000"/>
               <w:left w:val="single" w:sz="4" w:space="0" w:color="000000"/>
@@ -1499,21 +1456,7 @@
                 <w:rFonts w:cs="Arial" w:ascii="Arial Narrow" w:hAnsi="Arial Narrow"/>
                 <w:lang w:val="en-ID"/>
               </w:rPr>
-              <w:t>${konten_ma</w:t>
-            </w:r>
-            <w:r>
-              <w:rPr>
-                <w:rFonts w:cs="Arial" w:ascii="Arial Narrow" w:hAnsi="Arial Narrow"/>
-                <w:lang w:val="en-ID"/>
-              </w:rPr>
-              <w:t>t</w:t>
-            </w:r>
-            <w:r>
-              <w:rPr>
-                <w:rFonts w:cs="Arial" w:ascii="Arial Narrow" w:hAnsi="Arial Narrow"/>
-                <w:lang w:val="en-ID"/>
-              </w:rPr>
-              <w:t>eri_pembelajaran}</w:t>
+              <w:t>${konten_materi_pembelajaran}</w:t>
             </w:r>
           </w:p>
           <w:p>
@@ -1657,7 +1600,7 @@
         </w:tc>
         <w:tc>
           <w:tcPr>
-            <w:tcW w:w="1443" w:type="dxa"/>
+            <w:tcW w:w="1442" w:type="dxa"/>
             <w:tcBorders>
               <w:top w:val="single" w:sz="4" w:space="0" w:color="000000"/>
               <w:left w:val="single" w:sz="4" w:space="0" w:color="000000"/>
@@ -1769,7 +1712,7 @@
         </w:tc>
         <w:tc>
           <w:tcPr>
-            <w:tcW w:w="1260" w:type="dxa"/>
+            <w:tcW w:w="1263" w:type="dxa"/>
             <w:tcBorders>
               <w:top w:val="single" w:sz="4" w:space="0" w:color="000000"/>
               <w:left w:val="single" w:sz="4" w:space="0" w:color="000000"/>
@@ -2157,16 +2100,7 @@
                 <w:szCs w:val="24"/>
                 <w:lang w:val="id-ID"/>
               </w:rPr>
-              <w:t>$</w:t>
-            </w:r>
-            <w:r>
-              <w:rPr>
-                <w:rFonts w:cs="Arial" w:ascii="Arial Narrow" w:hAnsi="Arial Narrow"/>
-                <w:sz w:val="24"/>
-                <w:szCs w:val="24"/>
-                <w:lang w:val="id-ID"/>
-              </w:rPr>
-              <w:t>{penilaian_diri}</w:t>
+              <w:t>${penilaian_diri}</w:t>
             </w:r>
           </w:p>
           <w:p>
@@ -2462,7 +2396,7 @@
         </w:tc>
         <w:tc>
           <w:tcPr>
-            <w:tcW w:w="900" w:type="dxa"/>
+            <w:tcW w:w="902" w:type="dxa"/>
             <w:tcBorders>
               <w:top w:val="single" w:sz="4" w:space="0" w:color="000000"/>
               <w:left w:val="single" w:sz="4" w:space="0" w:color="000000"/>
@@ -2513,7 +2447,7 @@
         </w:tc>
         <w:tc>
           <w:tcPr>
-            <w:tcW w:w="1795" w:type="dxa"/>
+            <w:tcW w:w="1790" w:type="dxa"/>
             <w:tcBorders>
               <w:top w:val="single" w:sz="4" w:space="0" w:color="000000"/>
               <w:left w:val="single" w:sz="4" w:space="0" w:color="000000"/>
@@ -3641,6 +3575,363 @@
       </w:rPr>
     </w:lvl>
   </w:abstractNum>
+  <w:abstractNum w:abstractNumId="5">
+    <w:lvl w:ilvl="0">
+      <w:start w:val="1"/>
+      <w:numFmt w:val="decimal"/>
+      <w:lvlText w:val="%1."/>
+      <w:lvlJc w:val="left"/>
+      <w:pPr>
+        <w:tabs>
+          <w:tab w:val="num" w:pos="1233"/>
+        </w:tabs>
+        <w:ind w:left="1233" w:hanging="360"/>
+      </w:pPr>
+      <w:rPr/>
+    </w:lvl>
+    <w:lvl w:ilvl="1">
+      <w:start w:val="1"/>
+      <w:numFmt w:val="decimal"/>
+      <w:lvlText w:val="%2."/>
+      <w:lvlJc w:val="left"/>
+      <w:pPr>
+        <w:tabs>
+          <w:tab w:val="num" w:pos="1593"/>
+        </w:tabs>
+        <w:ind w:left="1593" w:hanging="360"/>
+      </w:pPr>
+      <w:rPr/>
+    </w:lvl>
+    <w:lvl w:ilvl="2">
+      <w:start w:val="1"/>
+      <w:numFmt w:val="decimal"/>
+      <w:lvlText w:val="%3."/>
+      <w:lvlJc w:val="left"/>
+      <w:pPr>
+        <w:tabs>
+          <w:tab w:val="num" w:pos="1953"/>
+        </w:tabs>
+        <w:ind w:left="1953" w:hanging="360"/>
+      </w:pPr>
+      <w:rPr/>
+    </w:lvl>
+    <w:lvl w:ilvl="3">
+      <w:start w:val="1"/>
+      <w:numFmt w:val="decimal"/>
+      <w:lvlText w:val="%4."/>
+      <w:lvlJc w:val="left"/>
+      <w:pPr>
+        <w:tabs>
+          <w:tab w:val="num" w:pos="2313"/>
+        </w:tabs>
+        <w:ind w:left="2313" w:hanging="360"/>
+      </w:pPr>
+      <w:rPr/>
+    </w:lvl>
+    <w:lvl w:ilvl="4">
+      <w:start w:val="1"/>
+      <w:numFmt w:val="decimal"/>
+      <w:lvlText w:val="%5."/>
+      <w:lvlJc w:val="left"/>
+      <w:pPr>
+        <w:tabs>
+          <w:tab w:val="num" w:pos="2673"/>
+        </w:tabs>
+        <w:ind w:left="2673" w:hanging="360"/>
+      </w:pPr>
+      <w:rPr/>
+    </w:lvl>
+    <w:lvl w:ilvl="5">
+      <w:start w:val="1"/>
+      <w:numFmt w:val="decimal"/>
+      <w:lvlText w:val="%6."/>
+      <w:lvlJc w:val="left"/>
+      <w:pPr>
+        <w:tabs>
+          <w:tab w:val="num" w:pos="3033"/>
+        </w:tabs>
+        <w:ind w:left="3033" w:hanging="360"/>
+      </w:pPr>
+      <w:rPr/>
+    </w:lvl>
+    <w:lvl w:ilvl="6">
+      <w:start w:val="1"/>
+      <w:numFmt w:val="decimal"/>
+      <w:lvlText w:val="%7."/>
+      <w:lvlJc w:val="left"/>
+      <w:pPr>
+        <w:tabs>
+          <w:tab w:val="num" w:pos="3393"/>
+        </w:tabs>
+        <w:ind w:left="3393" w:hanging="360"/>
+      </w:pPr>
+      <w:rPr/>
+    </w:lvl>
+    <w:lvl w:ilvl="7">
+      <w:start w:val="1"/>
+      <w:numFmt w:val="decimal"/>
+      <w:lvlText w:val="%8."/>
+      <w:lvlJc w:val="left"/>
+      <w:pPr>
+        <w:tabs>
+          <w:tab w:val="num" w:pos="3753"/>
+        </w:tabs>
+        <w:ind w:left="3753" w:hanging="360"/>
+      </w:pPr>
+      <w:rPr/>
+    </w:lvl>
+    <w:lvl w:ilvl="8">
+      <w:start w:val="1"/>
+      <w:numFmt w:val="decimal"/>
+      <w:lvlText w:val="%9."/>
+      <w:lvlJc w:val="left"/>
+      <w:pPr>
+        <w:tabs>
+          <w:tab w:val="num" w:pos="4113"/>
+        </w:tabs>
+        <w:ind w:left="4113" w:hanging="360"/>
+      </w:pPr>
+      <w:rPr/>
+    </w:lvl>
+  </w:abstractNum>
+  <w:abstractNum w:abstractNumId="6">
+    <w:lvl w:ilvl="0">
+      <w:start w:val="1"/>
+      <w:numFmt w:val="decimal"/>
+      <w:lvlText w:val="%1."/>
+      <w:lvlJc w:val="left"/>
+      <w:pPr>
+        <w:tabs>
+          <w:tab w:val="num" w:pos="1440"/>
+        </w:tabs>
+        <w:ind w:left="1440" w:hanging="360"/>
+      </w:pPr>
+      <w:rPr/>
+    </w:lvl>
+    <w:lvl w:ilvl="1">
+      <w:start w:val="1"/>
+      <w:numFmt w:val="decimal"/>
+      <w:lvlText w:val="%2."/>
+      <w:lvlJc w:val="left"/>
+      <w:pPr>
+        <w:tabs>
+          <w:tab w:val="num" w:pos="1800"/>
+        </w:tabs>
+        <w:ind w:left="1800" w:hanging="360"/>
+      </w:pPr>
+      <w:rPr/>
+    </w:lvl>
+    <w:lvl w:ilvl="2">
+      <w:start w:val="1"/>
+      <w:numFmt w:val="decimal"/>
+      <w:lvlText w:val="%3."/>
+      <w:lvlJc w:val="left"/>
+      <w:pPr>
+        <w:tabs>
+          <w:tab w:val="num" w:pos="2160"/>
+        </w:tabs>
+        <w:ind w:left="2160" w:hanging="360"/>
+      </w:pPr>
+      <w:rPr/>
+    </w:lvl>
+    <w:lvl w:ilvl="3">
+      <w:start w:val="1"/>
+      <w:numFmt w:val="decimal"/>
+      <w:lvlText w:val="%4."/>
+      <w:lvlJc w:val="left"/>
+      <w:pPr>
+        <w:tabs>
+          <w:tab w:val="num" w:pos="2520"/>
+        </w:tabs>
+        <w:ind w:left="2520" w:hanging="360"/>
+      </w:pPr>
+      <w:rPr/>
+    </w:lvl>
+    <w:lvl w:ilvl="4">
+      <w:start w:val="1"/>
+      <w:numFmt w:val="decimal"/>
+      <w:lvlText w:val="%5."/>
+      <w:lvlJc w:val="left"/>
+      <w:pPr>
+        <w:tabs>
+          <w:tab w:val="num" w:pos="2880"/>
+        </w:tabs>
+        <w:ind w:left="2880" w:hanging="360"/>
+      </w:pPr>
+      <w:rPr/>
+    </w:lvl>
+    <w:lvl w:ilvl="5">
+      <w:start w:val="1"/>
+      <w:numFmt w:val="decimal"/>
+      <w:lvlText w:val="%6."/>
+      <w:lvlJc w:val="left"/>
+      <w:pPr>
+        <w:tabs>
+          <w:tab w:val="num" w:pos="3240"/>
+        </w:tabs>
+        <w:ind w:left="3240" w:hanging="360"/>
+      </w:pPr>
+      <w:rPr/>
+    </w:lvl>
+    <w:lvl w:ilvl="6">
+      <w:start w:val="1"/>
+      <w:numFmt w:val="decimal"/>
+      <w:lvlText w:val="%7."/>
+      <w:lvlJc w:val="left"/>
+      <w:pPr>
+        <w:tabs>
+          <w:tab w:val="num" w:pos="3600"/>
+        </w:tabs>
+        <w:ind w:left="3600" w:hanging="360"/>
+      </w:pPr>
+      <w:rPr/>
+    </w:lvl>
+    <w:lvl w:ilvl="7">
+      <w:start w:val="1"/>
+      <w:numFmt w:val="decimal"/>
+      <w:lvlText w:val="%8."/>
+      <w:lvlJc w:val="left"/>
+      <w:pPr>
+        <w:tabs>
+          <w:tab w:val="num" w:pos="3960"/>
+        </w:tabs>
+        <w:ind w:left="3960" w:hanging="360"/>
+      </w:pPr>
+      <w:rPr/>
+    </w:lvl>
+    <w:lvl w:ilvl="8">
+      <w:start w:val="1"/>
+      <w:numFmt w:val="decimal"/>
+      <w:lvlText w:val="%9."/>
+      <w:lvlJc w:val="left"/>
+      <w:pPr>
+        <w:tabs>
+          <w:tab w:val="num" w:pos="4320"/>
+        </w:tabs>
+        <w:ind w:left="4320" w:hanging="360"/>
+      </w:pPr>
+      <w:rPr/>
+    </w:lvl>
+  </w:abstractNum>
+  <w:abstractNum w:abstractNumId="7">
+    <w:lvl w:ilvl="0">
+      <w:start w:val="1"/>
+      <w:numFmt w:val="decimal"/>
+      <w:lvlText w:val="%1."/>
+      <w:lvlJc w:val="left"/>
+      <w:pPr>
+        <w:tabs>
+          <w:tab w:val="num" w:pos="720"/>
+        </w:tabs>
+        <w:ind w:left="720" w:hanging="360"/>
+      </w:pPr>
+      <w:rPr/>
+    </w:lvl>
+    <w:lvl w:ilvl="1">
+      <w:start w:val="1"/>
+      <w:numFmt w:val="decimal"/>
+      <w:lvlText w:val="%2."/>
+      <w:lvlJc w:val="left"/>
+      <w:pPr>
+        <w:tabs>
+          <w:tab w:val="num" w:pos="1080"/>
+        </w:tabs>
+        <w:ind w:left="1080" w:hanging="360"/>
+      </w:pPr>
+      <w:rPr/>
+    </w:lvl>
+    <w:lvl w:ilvl="2">
+      <w:start w:val="1"/>
+      <w:numFmt w:val="decimal"/>
+      <w:lvlText w:val="%3."/>
+      <w:lvlJc w:val="left"/>
+      <w:pPr>
+        <w:tabs>
+          <w:tab w:val="num" w:pos="1440"/>
+        </w:tabs>
+        <w:ind w:left="1440" w:hanging="360"/>
+      </w:pPr>
+      <w:rPr/>
+    </w:lvl>
+    <w:lvl w:ilvl="3">
+      <w:start w:val="1"/>
+      <w:numFmt w:val="decimal"/>
+      <w:lvlText w:val="%4."/>
+      <w:lvlJc w:val="left"/>
+      <w:pPr>
+        <w:tabs>
+          <w:tab w:val="num" w:pos="1800"/>
+        </w:tabs>
+        <w:ind w:left="1800" w:hanging="360"/>
+      </w:pPr>
+      <w:rPr/>
+    </w:lvl>
+    <w:lvl w:ilvl="4">
+      <w:start w:val="1"/>
+      <w:numFmt w:val="decimal"/>
+      <w:lvlText w:val="%5."/>
+      <w:lvlJc w:val="left"/>
+      <w:pPr>
+        <w:tabs>
+          <w:tab w:val="num" w:pos="2160"/>
+        </w:tabs>
+        <w:ind w:left="2160" w:hanging="360"/>
+      </w:pPr>
+      <w:rPr/>
+    </w:lvl>
+    <w:lvl w:ilvl="5">
+      <w:start w:val="1"/>
+      <w:numFmt w:val="decimal"/>
+      <w:lvlText w:val="%6."/>
+      <w:lvlJc w:val="left"/>
+      <w:pPr>
+        <w:tabs>
+          <w:tab w:val="num" w:pos="2520"/>
+        </w:tabs>
+        <w:ind w:left="2520" w:hanging="360"/>
+      </w:pPr>
+      <w:rPr/>
+    </w:lvl>
+    <w:lvl w:ilvl="6">
+      <w:start w:val="1"/>
+      <w:numFmt w:val="decimal"/>
+      <w:lvlText w:val="%7."/>
+      <w:lvlJc w:val="left"/>
+      <w:pPr>
+        <w:tabs>
+          <w:tab w:val="num" w:pos="2880"/>
+        </w:tabs>
+        <w:ind w:left="2880" w:hanging="360"/>
+      </w:pPr>
+      <w:rPr/>
+    </w:lvl>
+    <w:lvl w:ilvl="7">
+      <w:start w:val="1"/>
+      <w:numFmt w:val="decimal"/>
+      <w:lvlText w:val="%8."/>
+      <w:lvlJc w:val="left"/>
+      <w:pPr>
+        <w:tabs>
+          <w:tab w:val="num" w:pos="3240"/>
+        </w:tabs>
+        <w:ind w:left="3240" w:hanging="360"/>
+      </w:pPr>
+      <w:rPr/>
+    </w:lvl>
+    <w:lvl w:ilvl="8">
+      <w:start w:val="1"/>
+      <w:numFmt w:val="decimal"/>
+      <w:lvlText w:val="%9."/>
+      <w:lvlJc w:val="left"/>
+      <w:pPr>
+        <w:tabs>
+          <w:tab w:val="num" w:pos="3600"/>
+        </w:tabs>
+        <w:ind w:left="3600" w:hanging="360"/>
+      </w:pPr>
+      <w:rPr/>
+    </w:lvl>
+  </w:abstractNum>
   <w:num w:numId="1">
     <w:abstractNumId w:val="1"/>
   </w:num>
@@ -3652,6 +3943,15 @@
   </w:num>
   <w:num w:numId="4">
     <w:abstractNumId w:val="4"/>
+  </w:num>
+  <w:num w:numId="5">
+    <w:abstractNumId w:val="5"/>
+  </w:num>
+  <w:num w:numId="6">
+    <w:abstractNumId w:val="6"/>
+  </w:num>
+  <w:num w:numId="7">
+    <w:abstractNumId w:val="7"/>
   </w:num>
 </w:numbering>
 </file>
@@ -3778,6 +4078,11 @@
       <w:szCs w:val="18"/>
       <w:lang w:val="en-ID"/>
     </w:rPr>
+  </w:style>
+  <w:style w:type="character" w:styleId="NumberingSymbols">
+    <w:name w:val="Numbering Symbols"/>
+    <w:qFormat/>
+    <w:rPr/>
   </w:style>
   <w:style w:type="paragraph" w:styleId="Heading">
     <w:name w:val="Heading"/>

</xml_diff>